<commit_message>
fix(quick-report): format vi defect dashes and summary
- normalize empty equipment/defect_area/remarks to '-' in vi summary
- format vi defect card description without dangling trailing/leading dashes
- surgically update 10. VISUAL DEFECT template preserving cell formatting
- add unit and end-to-end alignment tests for vi defect pages and summary
</commit_message>
<xml_diff>
--- a/templates/QUICK REPORT/10. VISUAL DEFECT Jinja2 DYNAMIC.docx
+++ b/templates/QUICK REPORT/10. VISUAL DEFECT Jinja2 DYNAMIC.docx
@@ -289,43 +289,7 @@
                 <w:sz w:val="20"/>
                 <w:szCs w:val="20"/>
               </w:rPr>
-              <w:t xml:space="preserve">{% if </w:t>
-            </w:r>
-            <w:proofErr w:type="spellStart"/>
-            <w:r>
-              <w:rPr>
-                <w:rFonts w:ascii="Tahoma" w:hAnsi="Tahoma" w:cs="Tahoma"/>
-                <w:sz w:val="20"/>
-                <w:szCs w:val="20"/>
-              </w:rPr>
-              <w:t>defects|length</w:t>
-            </w:r>
-            <w:proofErr w:type="spellEnd"/>
-            <w:r>
-              <w:rPr>
-                <w:rFonts w:ascii="Tahoma" w:hAnsi="Tahoma" w:cs="Tahoma"/>
-                <w:sz w:val="20"/>
-                <w:szCs w:val="20"/>
-              </w:rPr>
-              <w:t xml:space="preserve"> &gt; 0 %}{{ defects[0].</w:t>
-            </w:r>
-            <w:proofErr w:type="spellStart"/>
-            <w:r>
-              <w:rPr>
-                <w:rFonts w:ascii="Tahoma" w:hAnsi="Tahoma" w:cs="Tahoma"/>
-                <w:sz w:val="20"/>
-                <w:szCs w:val="20"/>
-              </w:rPr>
-              <w:t>defect_area</w:t>
-            </w:r>
-            <w:proofErr w:type="spellEnd"/>
-            <w:r>
-              <w:rPr>
-                <w:rFonts w:ascii="Tahoma" w:hAnsi="Tahoma" w:cs="Tahoma"/>
-                <w:sz w:val="20"/>
-                <w:szCs w:val="20"/>
-              </w:rPr>
-              <w:t xml:space="preserve"> }} – {{ defects[0].remarks }}{% endif %}</w:t>
+              <w:t xml:space="preserve">{% if defects|length &gt; 0 %}{{ defects[0].description }}{% endif %}</w:t>
             </w:r>
           </w:p>
         </w:tc>
@@ -378,43 +342,7 @@
                 <w:sz w:val="20"/>
                 <w:szCs w:val="20"/>
               </w:rPr>
-              <w:t xml:space="preserve">{% if </w:t>
-            </w:r>
-            <w:proofErr w:type="spellStart"/>
-            <w:r>
-              <w:rPr>
-                <w:rFonts w:ascii="Tahoma" w:hAnsi="Tahoma" w:cs="Tahoma"/>
-                <w:sz w:val="20"/>
-                <w:szCs w:val="20"/>
-              </w:rPr>
-              <w:t>defects|length</w:t>
-            </w:r>
-            <w:proofErr w:type="spellEnd"/>
-            <w:r>
-              <w:rPr>
-                <w:rFonts w:ascii="Tahoma" w:hAnsi="Tahoma" w:cs="Tahoma"/>
-                <w:sz w:val="20"/>
-                <w:szCs w:val="20"/>
-              </w:rPr>
-              <w:t xml:space="preserve"> &gt; 1 %}{{ defects[1].</w:t>
-            </w:r>
-            <w:proofErr w:type="spellStart"/>
-            <w:r>
-              <w:rPr>
-                <w:rFonts w:ascii="Tahoma" w:hAnsi="Tahoma" w:cs="Tahoma"/>
-                <w:sz w:val="20"/>
-                <w:szCs w:val="20"/>
-              </w:rPr>
-              <w:t>defect_area</w:t>
-            </w:r>
-            <w:proofErr w:type="spellEnd"/>
-            <w:r>
-              <w:rPr>
-                <w:rFonts w:ascii="Tahoma" w:hAnsi="Tahoma" w:cs="Tahoma"/>
-                <w:sz w:val="20"/>
-                <w:szCs w:val="20"/>
-              </w:rPr>
-              <w:t xml:space="preserve"> }} – {{ defects[1].remarks }}{% endif %}</w:t>
+              <w:t xml:space="preserve">{% if defects|length &gt; 1 %}{{ defects[1].description }}{% endif %}</w:t>
             </w:r>
           </w:p>
         </w:tc>
@@ -735,43 +663,7 @@
                 <w:sz w:val="20"/>
                 <w:szCs w:val="20"/>
               </w:rPr>
-              <w:t xml:space="preserve">{% if </w:t>
-            </w:r>
-            <w:proofErr w:type="spellStart"/>
-            <w:r>
-              <w:rPr>
-                <w:rFonts w:ascii="Tahoma" w:hAnsi="Tahoma" w:cs="Tahoma"/>
-                <w:sz w:val="20"/>
-                <w:szCs w:val="20"/>
-              </w:rPr>
-              <w:t>defects|length</w:t>
-            </w:r>
-            <w:proofErr w:type="spellEnd"/>
-            <w:r>
-              <w:rPr>
-                <w:rFonts w:ascii="Tahoma" w:hAnsi="Tahoma" w:cs="Tahoma"/>
-                <w:sz w:val="20"/>
-                <w:szCs w:val="20"/>
-              </w:rPr>
-              <w:t xml:space="preserve"> &gt; 2 %}{{ defects[2].</w:t>
-            </w:r>
-            <w:proofErr w:type="spellStart"/>
-            <w:r>
-              <w:rPr>
-                <w:rFonts w:ascii="Tahoma" w:hAnsi="Tahoma" w:cs="Tahoma"/>
-                <w:sz w:val="20"/>
-                <w:szCs w:val="20"/>
-              </w:rPr>
-              <w:t>defect_area</w:t>
-            </w:r>
-            <w:proofErr w:type="spellEnd"/>
-            <w:r>
-              <w:rPr>
-                <w:rFonts w:ascii="Tahoma" w:hAnsi="Tahoma" w:cs="Tahoma"/>
-                <w:sz w:val="20"/>
-                <w:szCs w:val="20"/>
-              </w:rPr>
-              <w:t xml:space="preserve"> }} – {{ defects[2].remarks }}{% endif %}</w:t>
+              <w:t xml:space="preserve">{% if defects|length &gt; 2 %}{{ defects[2].description }}{% endif %}</w:t>
             </w:r>
           </w:p>
         </w:tc>
@@ -824,43 +716,7 @@
                 <w:sz w:val="20"/>
                 <w:szCs w:val="20"/>
               </w:rPr>
-              <w:t xml:space="preserve">{% if </w:t>
-            </w:r>
-            <w:proofErr w:type="spellStart"/>
-            <w:r>
-              <w:rPr>
-                <w:rFonts w:ascii="Tahoma" w:hAnsi="Tahoma" w:cs="Tahoma"/>
-                <w:sz w:val="20"/>
-                <w:szCs w:val="20"/>
-              </w:rPr>
-              <w:t>defects|length</w:t>
-            </w:r>
-            <w:proofErr w:type="spellEnd"/>
-            <w:r>
-              <w:rPr>
-                <w:rFonts w:ascii="Tahoma" w:hAnsi="Tahoma" w:cs="Tahoma"/>
-                <w:sz w:val="20"/>
-                <w:szCs w:val="20"/>
-              </w:rPr>
-              <w:t xml:space="preserve"> &gt; 3 %}{{ defects[3].</w:t>
-            </w:r>
-            <w:proofErr w:type="spellStart"/>
-            <w:r>
-              <w:rPr>
-                <w:rFonts w:ascii="Tahoma" w:hAnsi="Tahoma" w:cs="Tahoma"/>
-                <w:sz w:val="20"/>
-                <w:szCs w:val="20"/>
-              </w:rPr>
-              <w:t>defect_area</w:t>
-            </w:r>
-            <w:proofErr w:type="spellEnd"/>
-            <w:r>
-              <w:rPr>
-                <w:rFonts w:ascii="Tahoma" w:hAnsi="Tahoma" w:cs="Tahoma"/>
-                <w:sz w:val="20"/>
-                <w:szCs w:val="20"/>
-              </w:rPr>
-              <w:t xml:space="preserve"> }} – {{ defects[3].remarks }}{% endif %}</w:t>
+              <w:t xml:space="preserve">{% if defects|length &gt; 3 %}{{ defects[3].description }}{% endif %}</w:t>
             </w:r>
           </w:p>
         </w:tc>
@@ -1182,44 +1038,7 @@
                 <w:sz w:val="20"/>
                 <w:szCs w:val="20"/>
               </w:rPr>
-              <w:lastRenderedPageBreak/>
-              <w:t xml:space="preserve">{% if </w:t>
-            </w:r>
-            <w:proofErr w:type="spellStart"/>
-            <w:r>
-              <w:rPr>
-                <w:rFonts w:ascii="Tahoma" w:hAnsi="Tahoma" w:cs="Tahoma"/>
-                <w:sz w:val="20"/>
-                <w:szCs w:val="20"/>
-              </w:rPr>
-              <w:t>defects|length</w:t>
-            </w:r>
-            <w:proofErr w:type="spellEnd"/>
-            <w:r>
-              <w:rPr>
-                <w:rFonts w:ascii="Tahoma" w:hAnsi="Tahoma" w:cs="Tahoma"/>
-                <w:sz w:val="20"/>
-                <w:szCs w:val="20"/>
-              </w:rPr>
-              <w:t xml:space="preserve"> &gt; 4 %}{{ defects[4].</w:t>
-            </w:r>
-            <w:proofErr w:type="spellStart"/>
-            <w:r>
-              <w:rPr>
-                <w:rFonts w:ascii="Tahoma" w:hAnsi="Tahoma" w:cs="Tahoma"/>
-                <w:sz w:val="20"/>
-                <w:szCs w:val="20"/>
-              </w:rPr>
-              <w:t>defect_area</w:t>
-            </w:r>
-            <w:proofErr w:type="spellEnd"/>
-            <w:r>
-              <w:rPr>
-                <w:rFonts w:ascii="Tahoma" w:hAnsi="Tahoma" w:cs="Tahoma"/>
-                <w:sz w:val="20"/>
-                <w:szCs w:val="20"/>
-              </w:rPr>
-              <w:t xml:space="preserve"> }} – {{ defects[4].remarks }}{% endif %}</w:t>
+              <w:t xml:space="preserve">{% if defects|length &gt; 4 %}{{ defects[4].description }}{% endif %}</w:t>
             </w:r>
           </w:p>
         </w:tc>
@@ -1274,43 +1093,7 @@
                 <w:sz w:val="20"/>
                 <w:szCs w:val="20"/>
               </w:rPr>
-              <w:t xml:space="preserve">{% if </w:t>
-            </w:r>
-            <w:proofErr w:type="spellStart"/>
-            <w:r>
-              <w:rPr>
-                <w:rFonts w:ascii="Tahoma" w:hAnsi="Tahoma" w:cs="Tahoma"/>
-                <w:sz w:val="20"/>
-                <w:szCs w:val="20"/>
-              </w:rPr>
-              <w:t>defects|length</w:t>
-            </w:r>
-            <w:proofErr w:type="spellEnd"/>
-            <w:r>
-              <w:rPr>
-                <w:rFonts w:ascii="Tahoma" w:hAnsi="Tahoma" w:cs="Tahoma"/>
-                <w:sz w:val="20"/>
-                <w:szCs w:val="20"/>
-              </w:rPr>
-              <w:t xml:space="preserve"> &gt; 5 %}{{ defects[5].</w:t>
-            </w:r>
-            <w:proofErr w:type="spellStart"/>
-            <w:r>
-              <w:rPr>
-                <w:rFonts w:ascii="Tahoma" w:hAnsi="Tahoma" w:cs="Tahoma"/>
-                <w:sz w:val="20"/>
-                <w:szCs w:val="20"/>
-              </w:rPr>
-              <w:t>defect_area</w:t>
-            </w:r>
-            <w:proofErr w:type="spellEnd"/>
-            <w:r>
-              <w:rPr>
-                <w:rFonts w:ascii="Tahoma" w:hAnsi="Tahoma" w:cs="Tahoma"/>
-                <w:sz w:val="20"/>
-                <w:szCs w:val="20"/>
-              </w:rPr>
-              <w:t xml:space="preserve"> }} – {{ defects[5].remarks }}{% endif %}</w:t>
+              <w:t xml:space="preserve">{% if defects|length &gt; 5 %}{{ defects[5].description }}{% endif %}</w:t>
             </w:r>
           </w:p>
         </w:tc>

</xml_diff>